<commit_message>
Chủ đề 1: làm lại phần chuẩn hóa dữ liệu cho dễ hiểu
- Ví dụ mới: đo cm thì máy nói Chi giống An, đo mét thì nói Bình; đổi đơn vị mà kết luận đảo ngược
- Giải thích công thức min-max bằng thước đo cả lớp 140–180 cm: An 150 cm đi được 10 trên cả quãng 40 → 0.25
- Sau chuẩn hóa An–Bình 0.25 < An–Chi 0.36, đúng cảm nhận; hình minh họa mới; cập nhật học liệu Word

Co-Authored-By: Claude Opus 5.5 <noreply@anthropic.com>
Claude-Session: https://claude.ai/code/session_01ScNDgkjKTL7veD34yUfSnC
</commit_message>
<xml_diff>
--- a/tai-lieu/chu-de-1-phan-loai-va-chia-nhom.docx
+++ b/tai-lieu/chu-de-1-phan-loai-va-chia-nhom.docx
@@ -7097,7 +7097,7 @@
           <w:sz w:val="26"/>
           <w:szCs w:val="26"/>
         </w:rPr>
-        <w:t xml:space="preserve">Giả sử ta mô tả học sinh bằng </w:t>
+        <w:t xml:space="preserve">Ba bạn được mô tả bằng </w:t>
       </w:r>
       <w:r>
         <w:rPr>
@@ -7117,7 +7117,7 @@
           <w:sz w:val="26"/>
           <w:szCs w:val="26"/>
         </w:rPr>
-        <w:t xml:space="preserve"> (cm) và </w:t>
+        <w:t xml:space="preserve"> và </w:t>
       </w:r>
       <w:r>
         <w:rPr>
@@ -7137,7 +7137,122 @@
           <w:sz w:val="26"/>
           <w:szCs w:val="26"/>
         </w:rPr>
-        <w:t xml:space="preserve"> (từ 0 đến 10): An (150, 9), Bình (165, 9), Chi (152, 3). Bình chỉ cao hơn An 15 cm, điểm Toán bằng nhau. Chi gần bằng An về chiều cao, nhưng điểm Toán kém An 6 điểm. Tính tổng bình phương:</w:t>
+        <w:t xml:space="preserve"> (thang 0 đến 10): </w:t>
+      </w:r>
+      <w:r>
+        <w:rPr>
+          <w:rFonts w:ascii="Times New Roman" w:cs="Times New Roman" w:eastAsia="Times New Roman" w:hAnsi="Times New Roman"/>
+          <w:b/>
+          <w:bCs/>
+          <w:color w:val="1D2B44"/>
+          <w:sz w:val="26"/>
+          <w:szCs w:val="26"/>
+        </w:rPr>
+        <w:t xml:space="preserve">An</w:t>
+      </w:r>
+      <w:r>
+        <w:rPr>
+          <w:rFonts w:ascii="Times New Roman" w:cs="Times New Roman" w:eastAsia="Times New Roman" w:hAnsi="Times New Roman"/>
+          <w:color w:val="1D2B44"/>
+          <w:sz w:val="26"/>
+          <w:szCs w:val="26"/>
+        </w:rPr>
+        <w:t xml:space="preserve"> (150 cm, 9 điểm), </w:t>
+      </w:r>
+      <w:r>
+        <w:rPr>
+          <w:rFonts w:ascii="Times New Roman" w:cs="Times New Roman" w:eastAsia="Times New Roman" w:hAnsi="Times New Roman"/>
+          <w:b/>
+          <w:bCs/>
+          <w:color w:val="1D2B44"/>
+          <w:sz w:val="26"/>
+          <w:szCs w:val="26"/>
+        </w:rPr>
+        <w:t xml:space="preserve">Bình</w:t>
+      </w:r>
+      <w:r>
+        <w:rPr>
+          <w:rFonts w:ascii="Times New Roman" w:cs="Times New Roman" w:eastAsia="Times New Roman" w:hAnsi="Times New Roman"/>
+          <w:color w:val="1D2B44"/>
+          <w:sz w:val="26"/>
+          <w:szCs w:val="26"/>
+        </w:rPr>
+        <w:t xml:space="preserve"> (170 cm, 9 điểm), </w:t>
+      </w:r>
+      <w:r>
+        <w:rPr>
+          <w:rFonts w:ascii="Times New Roman" w:cs="Times New Roman" w:eastAsia="Times New Roman" w:hAnsi="Times New Roman"/>
+          <w:b/>
+          <w:bCs/>
+          <w:color w:val="1D2B44"/>
+          <w:sz w:val="26"/>
+          <w:szCs w:val="26"/>
+        </w:rPr>
+        <w:t xml:space="preserve">Chi</w:t>
+      </w:r>
+      <w:r>
+        <w:rPr>
+          <w:rFonts w:ascii="Times New Roman" w:cs="Times New Roman" w:eastAsia="Times New Roman" w:hAnsi="Times New Roman"/>
+          <w:color w:val="1D2B44"/>
+          <w:sz w:val="26"/>
+          <w:szCs w:val="26"/>
+        </w:rPr>
+        <w:t xml:space="preserve"> (152 cm, 3 điểm). Theo em, ai giống An hơn? Bình cùng 9 điểm, chỉ cao hơn 20 cm. Chi thì kém An tận 6 điểm. Vậy </w:t>
+      </w:r>
+      <w:r>
+        <w:rPr>
+          <w:rFonts w:ascii="Times New Roman" w:cs="Times New Roman" w:eastAsia="Times New Roman" w:hAnsi="Times New Roman"/>
+          <w:b/>
+          <w:bCs/>
+          <w:color w:val="1D2B44"/>
+          <w:sz w:val="26"/>
+          <w:szCs w:val="26"/>
+        </w:rPr>
+        <w:t xml:space="preserve">Bình</w:t>
+      </w:r>
+      <w:r>
+        <w:rPr>
+          <w:rFonts w:ascii="Times New Roman" w:cs="Times New Roman" w:eastAsia="Times New Roman" w:hAnsi="Times New Roman"/>
+          <w:color w:val="1D2B44"/>
+          <w:sz w:val="26"/>
+          <w:szCs w:val="26"/>
+        </w:rPr>
+        <w:t xml:space="preserve"> giống An hơn.</w:t>
+      </w:r>
+    </w:p>
+    <w:p>
+      <w:pPr>
+        <w:spacing w:after="100" w:line="300"/>
+        <w:jc w:val="both"/>
+      </w:pPr>
+      <w:r>
+        <w:rPr>
+          <w:rFonts w:ascii="Times New Roman" w:cs="Times New Roman" w:eastAsia="Times New Roman" w:hAnsi="Times New Roman"/>
+          <w:color w:val="1D2B44"/>
+          <w:sz w:val="26"/>
+          <w:szCs w:val="26"/>
+        </w:rPr>
+        <w:t xml:space="preserve">Bây giờ để máy tính tổng bình phương, với chiều cao đo bằng </w:t>
+      </w:r>
+      <w:r>
+        <w:rPr>
+          <w:rFonts w:ascii="Times New Roman" w:cs="Times New Roman" w:eastAsia="Times New Roman" w:hAnsi="Times New Roman"/>
+          <w:b/>
+          <w:bCs/>
+          <w:color w:val="1D2B44"/>
+          <w:sz w:val="26"/>
+          <w:szCs w:val="26"/>
+        </w:rPr>
+        <w:t xml:space="preserve">xăng-ti-mét</w:t>
+      </w:r>
+      <w:r>
+        <w:rPr>
+          <w:rFonts w:ascii="Times New Roman" w:cs="Times New Roman" w:eastAsia="Times New Roman" w:hAnsi="Times New Roman"/>
+          <w:color w:val="1D2B44"/>
+          <w:sz w:val="26"/>
+          <w:szCs w:val="26"/>
+        </w:rPr>
+        <w:t xml:space="preserve">:</w:t>
       </w:r>
     </w:p>
     <w:p>
@@ -7157,18 +7272,18 @@
           <w:sz w:val="26"/>
           <w:szCs w:val="26"/>
         </w:rPr>
-        <w:t xml:space="preserve">An – Bình: 15² + 0² = </w:t>
-      </w:r>
-      <w:r>
-        <w:rPr>
-          <w:rFonts w:ascii="Times New Roman" w:cs="Times New Roman" w:eastAsia="Times New Roman" w:hAnsi="Times New Roman"/>
-          <w:b/>
-          <w:bCs/>
-          <w:color w:val="1D2B44"/>
-          <w:sz w:val="26"/>
-          <w:szCs w:val="26"/>
-        </w:rPr>
-        <w:t xml:space="preserve">225</w:t>
+        <w:t xml:space="preserve">An – Bình: 20² + 0² = </w:t>
+      </w:r>
+      <w:r>
+        <w:rPr>
+          <w:rFonts w:ascii="Times New Roman" w:cs="Times New Roman" w:eastAsia="Times New Roman" w:hAnsi="Times New Roman"/>
+          <w:b/>
+          <w:bCs/>
+          <w:color w:val="1D2B44"/>
+          <w:sz w:val="26"/>
+          <w:szCs w:val="26"/>
+        </w:rPr>
+        <w:t xml:space="preserve">400</w:t>
       </w:r>
       <w:r>
         <w:rPr>
@@ -7217,7 +7332,27 @@
           <w:sz w:val="26"/>
           <w:szCs w:val="26"/>
         </w:rPr>
-        <w:t xml:space="preserve">.</w:t>
+        <w:t xml:space="preserve">. Máy nói </w:t>
+      </w:r>
+      <w:r>
+        <w:rPr>
+          <w:rFonts w:ascii="Times New Roman" w:cs="Times New Roman" w:eastAsia="Times New Roman" w:hAnsi="Times New Roman"/>
+          <w:b/>
+          <w:bCs/>
+          <w:color w:val="1D2B44"/>
+          <w:sz w:val="26"/>
+          <w:szCs w:val="26"/>
+        </w:rPr>
+        <w:t xml:space="preserve">Chi</w:t>
+      </w:r>
+      <w:r>
+        <w:rPr>
+          <w:rFonts w:ascii="Times New Roman" w:cs="Times New Roman" w:eastAsia="Times New Roman" w:hAnsi="Times New Roman"/>
+          <w:color w:val="1D2B44"/>
+          <w:sz w:val="26"/>
+          <w:szCs w:val="26"/>
+        </w:rPr>
+        <w:t xml:space="preserve"> giống An hơn!</w:t>
       </w:r>
     </w:p>
     <w:p>
@@ -7232,48 +7367,605 @@
           <w:sz w:val="26"/>
           <w:szCs w:val="26"/>
         </w:rPr>
-        <w:t xml:space="preserve">Theo con số, Chi "giống" An hơn Bình rất nhiều. Nhưng hãy nghĩ lại: lệch 6 điểm Toán (trên thang 10 điểm) là lệch </w:t>
-      </w:r>
-      <w:r>
-        <w:rPr>
-          <w:rFonts w:ascii="Times New Roman" w:cs="Times New Roman" w:eastAsia="Times New Roman" w:hAnsi="Times New Roman"/>
-          <w:b/>
-          <w:bCs/>
-          <w:color w:val="1D2B44"/>
-          <w:sz w:val="26"/>
-          <w:szCs w:val="26"/>
-        </w:rPr>
-        <w:t xml:space="preserve">rất nhiều</w:t>
-      </w:r>
-      <w:r>
-        <w:rPr>
-          <w:rFonts w:ascii="Times New Roman" w:cs="Times New Roman" w:eastAsia="Times New Roman" w:hAnsi="Times New Roman"/>
-          <w:color w:val="1D2B44"/>
-          <w:sz w:val="26"/>
-          <w:szCs w:val="26"/>
-        </w:rPr>
-        <w:t xml:space="preserve">, còn lệch 15 cm chiều cao chỉ là chuyện bình thường. Con số sai lệch như vậy vì chiều cao tính bằng cm nên các số rất lớn, </w:t>
-      </w:r>
-      <w:r>
-        <w:rPr>
-          <w:rFonts w:ascii="Times New Roman" w:cs="Times New Roman" w:eastAsia="Times New Roman" w:hAnsi="Times New Roman"/>
-          <w:b/>
-          <w:bCs/>
-          <w:color w:val="1D2B44"/>
-          <w:sz w:val="26"/>
-          <w:szCs w:val="26"/>
-        </w:rPr>
-        <w:t xml:space="preserve">lấn át</w:t>
-      </w:r>
-      <w:r>
-        <w:rPr>
-          <w:rFonts w:ascii="Times New Roman" w:cs="Times New Roman" w:eastAsia="Times New Roman" w:hAnsi="Times New Roman"/>
-          <w:color w:val="1D2B44"/>
-          <w:sz w:val="26"/>
-          <w:szCs w:val="26"/>
-        </w:rPr>
-        <w:t xml:space="preserve"> điểm Toán. Như vậy là không công bằng.</w:t>
-      </w:r>
+        <w:t xml:space="preserve">Cũng ba bạn đó, nhưng đo chiều cao bằng </w:t>
+      </w:r>
+      <w:r>
+        <w:rPr>
+          <w:rFonts w:ascii="Times New Roman" w:cs="Times New Roman" w:eastAsia="Times New Roman" w:hAnsi="Times New Roman"/>
+          <w:b/>
+          <w:bCs/>
+          <w:color w:val="1D2B44"/>
+          <w:sz w:val="26"/>
+          <w:szCs w:val="26"/>
+        </w:rPr>
+        <w:t xml:space="preserve">mét</w:t>
+      </w:r>
+      <w:r>
+        <w:rPr>
+          <w:rFonts w:ascii="Times New Roman" w:cs="Times New Roman" w:eastAsia="Times New Roman" w:hAnsi="Times New Roman"/>
+          <w:color w:val="1D2B44"/>
+          <w:sz w:val="26"/>
+          <w:szCs w:val="26"/>
+        </w:rPr>
+        <w:t xml:space="preserve"> (1.50; 1.70; 1.52):</w:t>
+      </w:r>
+    </w:p>
+    <w:p>
+      <w:pPr>
+        <w:pStyle w:val="ListParagraph"/>
+        <w:numPr>
+          <w:ilvl w:val="0"/>
+          <w:numId w:val="2"/>
+        </w:numPr>
+        <w:spacing w:after="60" w:line="300"/>
+        <w:jc w:val="left"/>
+      </w:pPr>
+      <w:r>
+        <w:rPr>
+          <w:rFonts w:ascii="Times New Roman" w:cs="Times New Roman" w:eastAsia="Times New Roman" w:hAnsi="Times New Roman"/>
+          <w:color w:val="1D2B44"/>
+          <w:sz w:val="26"/>
+          <w:szCs w:val="26"/>
+        </w:rPr>
+        <w:t xml:space="preserve">An – Bình: 0.2² + 0² = </w:t>
+      </w:r>
+      <w:r>
+        <w:rPr>
+          <w:rFonts w:ascii="Times New Roman" w:cs="Times New Roman" w:eastAsia="Times New Roman" w:hAnsi="Times New Roman"/>
+          <w:b/>
+          <w:bCs/>
+          <w:color w:val="1D2B44"/>
+          <w:sz w:val="26"/>
+          <w:szCs w:val="26"/>
+        </w:rPr>
+        <w:t xml:space="preserve">0.04</w:t>
+      </w:r>
+      <w:r>
+        <w:rPr>
+          <w:rFonts w:ascii="Times New Roman" w:cs="Times New Roman" w:eastAsia="Times New Roman" w:hAnsi="Times New Roman"/>
+          <w:color w:val="1D2B44"/>
+          <w:sz w:val="26"/>
+          <w:szCs w:val="26"/>
+        </w:rPr>
+        <w:t xml:space="preserve">.</w:t>
+      </w:r>
+    </w:p>
+    <w:p>
+      <w:pPr>
+        <w:pStyle w:val="ListParagraph"/>
+        <w:numPr>
+          <w:ilvl w:val="0"/>
+          <w:numId w:val="2"/>
+        </w:numPr>
+        <w:spacing w:after="60" w:line="300"/>
+        <w:jc w:val="left"/>
+      </w:pPr>
+      <w:r>
+        <w:rPr>
+          <w:rFonts w:ascii="Times New Roman" w:cs="Times New Roman" w:eastAsia="Times New Roman" w:hAnsi="Times New Roman"/>
+          <w:color w:val="1D2B44"/>
+          <w:sz w:val="26"/>
+          <w:szCs w:val="26"/>
+        </w:rPr>
+        <w:t xml:space="preserve">An – Chi: 0.02² + 6² ≈ </w:t>
+      </w:r>
+      <w:r>
+        <w:rPr>
+          <w:rFonts w:ascii="Times New Roman" w:cs="Times New Roman" w:eastAsia="Times New Roman" w:hAnsi="Times New Roman"/>
+          <w:b/>
+          <w:bCs/>
+          <w:color w:val="1D2B44"/>
+          <w:sz w:val="26"/>
+          <w:szCs w:val="26"/>
+        </w:rPr>
+        <w:t xml:space="preserve">36</w:t>
+      </w:r>
+      <w:r>
+        <w:rPr>
+          <w:rFonts w:ascii="Times New Roman" w:cs="Times New Roman" w:eastAsia="Times New Roman" w:hAnsi="Times New Roman"/>
+          <w:color w:val="1D2B44"/>
+          <w:sz w:val="26"/>
+          <w:szCs w:val="26"/>
+        </w:rPr>
+        <w:t xml:space="preserve">. Lần này máy lại nói </w:t>
+      </w:r>
+      <w:r>
+        <w:rPr>
+          <w:rFonts w:ascii="Times New Roman" w:cs="Times New Roman" w:eastAsia="Times New Roman" w:hAnsi="Times New Roman"/>
+          <w:b/>
+          <w:bCs/>
+          <w:color w:val="1D2B44"/>
+          <w:sz w:val="26"/>
+          <w:szCs w:val="26"/>
+        </w:rPr>
+        <w:t xml:space="preserve">Bình</w:t>
+      </w:r>
+      <w:r>
+        <w:rPr>
+          <w:rFonts w:ascii="Times New Roman" w:cs="Times New Roman" w:eastAsia="Times New Roman" w:hAnsi="Times New Roman"/>
+          <w:color w:val="1D2B44"/>
+          <w:sz w:val="26"/>
+          <w:szCs w:val="26"/>
+        </w:rPr>
+        <w:t xml:space="preserve"> giống An hơn.</w:t>
+      </w:r>
+    </w:p>
+    <w:tbl>
+      <w:tblPr>
+        <w:tblW w:type="dxa" w:w="9638"/>
+        <w:tblBorders>
+          <w:top w:val="single" w:color="auto" w:sz="4"/>
+          <w:left w:val="single" w:color="auto" w:sz="4"/>
+          <w:bottom w:val="single" w:color="auto" w:sz="4"/>
+          <w:right w:val="single" w:color="auto" w:sz="4"/>
+          <w:insideH w:val="single" w:color="auto" w:sz="4"/>
+          <w:insideV w:val="single" w:color="auto" w:sz="4"/>
+        </w:tblBorders>
+      </w:tblPr>
+      <w:tblGrid>
+        <w:gridCol w:w="9638"/>
+      </w:tblGrid>
+      <w:tr>
+        <w:trPr>
+          <w:cantSplit/>
+        </w:trPr>
+        <w:tc>
+          <w:tcPr>
+            <w:tcW w:type="dxa" w:w="9638"/>
+            <w:tcBorders>
+              <w:top w:val="none" w:color="FFFFFF" w:sz="0"/>
+              <w:left w:val="single" w:color="C25E00" w:sz="36"/>
+              <w:bottom w:val="none" w:color="FFFFFF" w:sz="0"/>
+              <w:right w:val="none" w:color="FFFFFF" w:sz="0"/>
+            </w:tcBorders>
+            <w:shd w:fill="FFF1E0" w:color="auto" w:val="clear"/>
+            <w:tcMar>
+              <w:top w:type="dxa" w:w="120"/>
+              <w:left w:type="dxa" w:w="220"/>
+              <w:bottom w:type="dxa" w:w="120"/>
+              <w:right w:type="dxa" w:w="180"/>
+            </w:tcMar>
+          </w:tcPr>
+          <w:p>
+            <w:pPr>
+              <w:spacing w:after="80"/>
+            </w:pPr>
+            <w:r>
+              <w:rPr>
+                <w:rFonts w:ascii="Times New Roman" w:cs="Times New Roman" w:eastAsia="Times New Roman" w:hAnsi="Times New Roman"/>
+                <w:b/>
+                <w:bCs/>
+                <w:color w:val="C25E00"/>
+                <w:sz w:val="26"/>
+                <w:szCs w:val="26"/>
+              </w:rPr>
+              <w:t xml:space="preserve">VẤN ĐỀ</w:t>
+            </w:r>
+          </w:p>
+          <w:p>
+            <w:pPr>
+              <w:spacing w:after="60" w:line="300"/>
+            </w:pPr>
+            <w:r>
+              <w:rPr>
+                <w:rFonts w:ascii="Times New Roman" w:cs="Times New Roman" w:eastAsia="Times New Roman" w:hAnsi="Times New Roman"/>
+                <w:color w:val="1D2B44"/>
+                <w:sz w:val="26"/>
+                <w:szCs w:val="26"/>
+              </w:rPr>
+              <w:t xml:space="preserve">Chỉ đổi đơn vị đo mà kết luận </w:t>
+            </w:r>
+            <w:r>
+              <w:rPr>
+                <w:rFonts w:ascii="Times New Roman" w:cs="Times New Roman" w:eastAsia="Times New Roman" w:hAnsi="Times New Roman"/>
+                <w:b/>
+                <w:bCs/>
+                <w:color w:val="1D2B44"/>
+                <w:sz w:val="26"/>
+                <w:szCs w:val="26"/>
+              </w:rPr>
+              <w:t xml:space="preserve">đảo ngược</w:t>
+            </w:r>
+            <w:r>
+              <w:rPr>
+                <w:rFonts w:ascii="Times New Roman" w:cs="Times New Roman" w:eastAsia="Times New Roman" w:hAnsi="Times New Roman"/>
+                <w:color w:val="1D2B44"/>
+                <w:sz w:val="26"/>
+                <w:szCs w:val="26"/>
+              </w:rPr>
+              <w:t xml:space="preserve">. Cột nào có số to thì cột đó "nói to" hơn và lấn át các cột khác. So sánh như vậy là chưa công bằng.</w:t>
+            </w:r>
+          </w:p>
+        </w:tc>
+      </w:tr>
+    </w:tbl>
+    <w:p>
+      <w:pPr>
+        <w:spacing w:after="140"/>
+      </w:pPr>
+    </w:p>
+    <w:p>
+      <w:pPr>
+        <w:spacing w:after="100" w:line="300"/>
+        <w:jc w:val="both"/>
+      </w:pPr>
+      <w:r>
+        <w:rPr>
+          <w:rFonts w:ascii="Times New Roman" w:cs="Times New Roman" w:eastAsia="Times New Roman" w:hAnsi="Times New Roman"/>
+          <w:color w:val="1D2B44"/>
+          <w:sz w:val="26"/>
+          <w:szCs w:val="26"/>
+        </w:rPr>
+        <w:t xml:space="preserve">Cách sửa: đưa mọi cột về </w:t>
+      </w:r>
+      <w:r>
+        <w:rPr>
+          <w:rFonts w:ascii="Times New Roman" w:cs="Times New Roman" w:eastAsia="Times New Roman" w:hAnsi="Times New Roman"/>
+          <w:b/>
+          <w:bCs/>
+          <w:color w:val="1D2B44"/>
+          <w:sz w:val="26"/>
+          <w:szCs w:val="26"/>
+        </w:rPr>
+        <w:t xml:space="preserve">cùng một thang từ 0 đến 1</w:t>
+      </w:r>
+      <w:r>
+        <w:rPr>
+          <w:rFonts w:ascii="Times New Roman" w:cs="Times New Roman" w:eastAsia="Times New Roman" w:hAnsi="Times New Roman"/>
+          <w:color w:val="1D2B44"/>
+          <w:sz w:val="26"/>
+          <w:szCs w:val="26"/>
+        </w:rPr>
+        <w:t xml:space="preserve">. Cách đơn giản nhất là </w:t>
+      </w:r>
+      <w:r>
+        <w:rPr>
+          <w:rFonts w:ascii="Times New Roman" w:cs="Times New Roman" w:eastAsia="Times New Roman" w:hAnsi="Times New Roman"/>
+          <w:b/>
+          <w:bCs/>
+          <w:color w:val="1D2B44"/>
+          <w:sz w:val="26"/>
+          <w:szCs w:val="26"/>
+        </w:rPr>
+        <w:t xml:space="preserve">chuẩn hóa min-max</w:t>
+      </w:r>
+      <w:r>
+        <w:rPr>
+          <w:rFonts w:ascii="Times New Roman" w:cs="Times New Roman" w:eastAsia="Times New Roman" w:hAnsi="Times New Roman"/>
+          <w:color w:val="1D2B44"/>
+          <w:sz w:val="26"/>
+          <w:szCs w:val="26"/>
+        </w:rPr>
+        <w:t xml:space="preserve">:</w:t>
+      </w:r>
+    </w:p>
+    <w:p>
+      <w:pPr>
+        <w:spacing w:after="120" w:before="60" w:line="300"/>
+        <w:jc w:val="center"/>
+      </w:pPr>
+      <w:r>
+        <w:rPr>
+          <w:rFonts w:ascii="Times New Roman" w:cs="Times New Roman" w:eastAsia="Times New Roman" w:hAnsi="Times New Roman"/>
+          <w:b/>
+          <w:bCs/>
+          <w:color w:val="1A5FC8"/>
+          <w:sz w:val="26"/>
+          <w:szCs w:val="26"/>
+        </w:rPr>
+        <w:t xml:space="preserve">giá trị mới = (giá trị − nhỏ nhất) : (lớn nhất − nhỏ nhất)</w:t>
+      </w:r>
+    </w:p>
+    <w:p>
+      <w:pPr>
+        <w:spacing w:after="100" w:line="300"/>
+        <w:jc w:val="both"/>
+      </w:pPr>
+      <w:r>
+        <w:rPr>
+          <w:rFonts w:ascii="Times New Roman" w:cs="Times New Roman" w:eastAsia="Times New Roman" w:hAnsi="Times New Roman"/>
+          <w:color w:val="1D2B44"/>
+          <w:sz w:val="26"/>
+          <w:szCs w:val="26"/>
+        </w:rPr>
+        <w:t xml:space="preserve">Đọc công thức thành lời: </w:t>
+      </w:r>
+      <w:r>
+        <w:rPr>
+          <w:rFonts w:ascii="Times New Roman" w:cs="Times New Roman" w:eastAsia="Times New Roman" w:hAnsi="Times New Roman"/>
+          <w:b/>
+          <w:bCs/>
+          <w:color w:val="1D2B44"/>
+          <w:sz w:val="26"/>
+          <w:szCs w:val="26"/>
+        </w:rPr>
+        <w:t xml:space="preserve">"đã đi được bao xa từ chỗ thấp nhất"</w:t>
+      </w:r>
+      <w:r>
+        <w:rPr>
+          <w:rFonts w:ascii="Times New Roman" w:cs="Times New Roman" w:eastAsia="Times New Roman" w:hAnsi="Times New Roman"/>
+          <w:color w:val="1D2B44"/>
+          <w:sz w:val="26"/>
+          <w:szCs w:val="26"/>
+        </w:rPr>
+        <w:t xml:space="preserve"> chia cho </w:t>
+      </w:r>
+      <w:r>
+        <w:rPr>
+          <w:rFonts w:ascii="Times New Roman" w:cs="Times New Roman" w:eastAsia="Times New Roman" w:hAnsi="Times New Roman"/>
+          <w:b/>
+          <w:bCs/>
+          <w:color w:val="1D2B44"/>
+          <w:sz w:val="26"/>
+          <w:szCs w:val="26"/>
+        </w:rPr>
+        <w:t xml:space="preserve">"cả quãng dài bao nhiêu"</w:t>
+      </w:r>
+      <w:r>
+        <w:rPr>
+          <w:rFonts w:ascii="Times New Roman" w:cs="Times New Roman" w:eastAsia="Times New Roman" w:hAnsi="Times New Roman"/>
+          <w:color w:val="1D2B44"/>
+          <w:sz w:val="26"/>
+          <w:szCs w:val="26"/>
+        </w:rPr>
+        <w:t xml:space="preserve">.</w:t>
+      </w:r>
+    </w:p>
+    <w:tbl>
+      <w:tblPr>
+        <w:tblW w:type="dxa" w:w="9638"/>
+        <w:tblBorders>
+          <w:top w:val="single" w:color="auto" w:sz="4"/>
+          <w:left w:val="single" w:color="auto" w:sz="4"/>
+          <w:bottom w:val="single" w:color="auto" w:sz="4"/>
+          <w:right w:val="single" w:color="auto" w:sz="4"/>
+          <w:insideH w:val="single" w:color="auto" w:sz="4"/>
+          <w:insideV w:val="single" w:color="auto" w:sz="4"/>
+        </w:tblBorders>
+      </w:tblPr>
+      <w:tblGrid>
+        <w:gridCol w:w="9638"/>
+      </w:tblGrid>
+      <w:tr>
+        <w:trPr>
+          <w:cantSplit/>
+        </w:trPr>
+        <w:tc>
+          <w:tcPr>
+            <w:tcW w:type="dxa" w:w="9638"/>
+            <w:tcBorders>
+              <w:top w:val="none" w:color="FFFFFF" w:sz="0"/>
+              <w:left w:val="single" w:color="8A94A6" w:sz="36"/>
+              <w:bottom w:val="none" w:color="FFFFFF" w:sz="0"/>
+              <w:right w:val="none" w:color="FFFFFF" w:sz="0"/>
+            </w:tcBorders>
+            <w:shd w:fill="F3F5F8" w:color="auto" w:val="clear"/>
+            <w:tcMar>
+              <w:top w:type="dxa" w:w="120"/>
+              <w:left w:type="dxa" w:w="220"/>
+              <w:bottom w:type="dxa" w:w="120"/>
+              <w:right w:type="dxa" w:w="180"/>
+            </w:tcMar>
+          </w:tcPr>
+          <w:p>
+            <w:pPr>
+              <w:spacing w:after="80"/>
+            </w:pPr>
+            <w:r>
+              <w:rPr>
+                <w:rFonts w:ascii="Times New Roman" w:cs="Times New Roman" w:eastAsia="Times New Roman" w:hAnsi="Times New Roman"/>
+                <w:b/>
+                <w:bCs/>
+                <w:color w:val="8A94A6"/>
+                <w:sz w:val="26"/>
+                <w:szCs w:val="26"/>
+              </w:rPr>
+              <w:t xml:space="preserve">VÍ DỤ</w:t>
+            </w:r>
+          </w:p>
+          <w:p>
+            <w:pPr>
+              <w:spacing w:after="60" w:line="300"/>
+            </w:pPr>
+            <w:r>
+              <w:rPr>
+                <w:rFonts w:ascii="Times New Roman" w:cs="Times New Roman" w:eastAsia="Times New Roman" w:hAnsi="Times New Roman"/>
+                <w:color w:val="1D2B44"/>
+                <w:sz w:val="26"/>
+                <w:szCs w:val="26"/>
+              </w:rPr>
+              <w:t xml:space="preserve">Chiều cao cả lớp từ </w:t>
+            </w:r>
+            <w:r>
+              <w:rPr>
+                <w:rFonts w:ascii="Times New Roman" w:cs="Times New Roman" w:eastAsia="Times New Roman" w:hAnsi="Times New Roman"/>
+                <w:b/>
+                <w:bCs/>
+                <w:color w:val="1D2B44"/>
+                <w:sz w:val="26"/>
+                <w:szCs w:val="26"/>
+              </w:rPr>
+              <w:t xml:space="preserve">140 cm</w:t>
+            </w:r>
+            <w:r>
+              <w:rPr>
+                <w:rFonts w:ascii="Times New Roman" w:cs="Times New Roman" w:eastAsia="Times New Roman" w:hAnsi="Times New Roman"/>
+                <w:color w:val="1D2B44"/>
+                <w:sz w:val="26"/>
+                <w:szCs w:val="26"/>
+              </w:rPr>
+              <w:t xml:space="preserve"> (thấp nhất) đến </w:t>
+            </w:r>
+            <w:r>
+              <w:rPr>
+                <w:rFonts w:ascii="Times New Roman" w:cs="Times New Roman" w:eastAsia="Times New Roman" w:hAnsi="Times New Roman"/>
+                <w:b/>
+                <w:bCs/>
+                <w:color w:val="1D2B44"/>
+                <w:sz w:val="26"/>
+                <w:szCs w:val="26"/>
+              </w:rPr>
+              <w:t xml:space="preserve">180 cm</w:t>
+            </w:r>
+            <w:r>
+              <w:rPr>
+                <w:rFonts w:ascii="Times New Roman" w:cs="Times New Roman" w:eastAsia="Times New Roman" w:hAnsi="Times New Roman"/>
+                <w:color w:val="1D2B44"/>
+                <w:sz w:val="26"/>
+                <w:szCs w:val="26"/>
+              </w:rPr>
+              <w:t xml:space="preserve"> (cao nhất), nên cả quãng là 180 − 140 = 40.</w:t>
+            </w:r>
+          </w:p>
+          <w:p>
+            <w:pPr>
+              <w:spacing w:after="60" w:line="300"/>
+            </w:pPr>
+            <w:r>
+              <w:rPr>
+                <w:rFonts w:ascii="Times New Roman" w:cs="Times New Roman" w:eastAsia="Times New Roman" w:hAnsi="Times New Roman"/>
+                <w:color w:val="1D2B44"/>
+                <w:sz w:val="26"/>
+                <w:szCs w:val="26"/>
+              </w:rPr>
+              <w:t xml:space="preserve">An cao 150 cm, tức là đi được 150 − 140 = 10. Vậy An → 10 : 40 = </w:t>
+            </w:r>
+            <w:r>
+              <w:rPr>
+                <w:rFonts w:ascii="Times New Roman" w:cs="Times New Roman" w:eastAsia="Times New Roman" w:hAnsi="Times New Roman"/>
+                <w:b/>
+                <w:bCs/>
+                <w:color w:val="1D2B44"/>
+                <w:sz w:val="26"/>
+                <w:szCs w:val="26"/>
+              </w:rPr>
+              <w:t xml:space="preserve">0.25</w:t>
+            </w:r>
+            <w:r>
+              <w:rPr>
+                <w:rFonts w:ascii="Times New Roman" w:cs="Times New Roman" w:eastAsia="Times New Roman" w:hAnsi="Times New Roman"/>
+                <w:color w:val="1D2B44"/>
+                <w:sz w:val="26"/>
+                <w:szCs w:val="26"/>
+              </w:rPr>
+              <w:t xml:space="preserve">: An đứng ở một phần tư quãng.</w:t>
+            </w:r>
+          </w:p>
+          <w:p>
+            <w:pPr>
+              <w:spacing w:after="60" w:line="300"/>
+            </w:pPr>
+            <w:r>
+              <w:rPr>
+                <w:rFonts w:ascii="Times New Roman" w:cs="Times New Roman" w:eastAsia="Times New Roman" w:hAnsi="Times New Roman"/>
+                <w:color w:val="1D2B44"/>
+                <w:sz w:val="26"/>
+                <w:szCs w:val="26"/>
+              </w:rPr>
+              <w:t xml:space="preserve">Bình 170 cm → 30 : 40 = </w:t>
+            </w:r>
+            <w:r>
+              <w:rPr>
+                <w:rFonts w:ascii="Times New Roman" w:cs="Times New Roman" w:eastAsia="Times New Roman" w:hAnsi="Times New Roman"/>
+                <w:b/>
+                <w:bCs/>
+                <w:color w:val="1D2B44"/>
+                <w:sz w:val="26"/>
+                <w:szCs w:val="26"/>
+              </w:rPr>
+              <w:t xml:space="preserve">0.75</w:t>
+            </w:r>
+            <w:r>
+              <w:rPr>
+                <w:rFonts w:ascii="Times New Roman" w:cs="Times New Roman" w:eastAsia="Times New Roman" w:hAnsi="Times New Roman"/>
+                <w:color w:val="1D2B44"/>
+                <w:sz w:val="26"/>
+                <w:szCs w:val="26"/>
+              </w:rPr>
+              <w:t xml:space="preserve">. Chi 152 cm → 12 : 40 = </w:t>
+            </w:r>
+            <w:r>
+              <w:rPr>
+                <w:rFonts w:ascii="Times New Roman" w:cs="Times New Roman" w:eastAsia="Times New Roman" w:hAnsi="Times New Roman"/>
+                <w:b/>
+                <w:bCs/>
+                <w:color w:val="1D2B44"/>
+                <w:sz w:val="26"/>
+                <w:szCs w:val="26"/>
+              </w:rPr>
+              <w:t xml:space="preserve">0.3</w:t>
+            </w:r>
+            <w:r>
+              <w:rPr>
+                <w:rFonts w:ascii="Times New Roman" w:cs="Times New Roman" w:eastAsia="Times New Roman" w:hAnsi="Times New Roman"/>
+                <w:color w:val="1D2B44"/>
+                <w:sz w:val="26"/>
+                <w:szCs w:val="26"/>
+              </w:rPr>
+              <w:t xml:space="preserve">. Bạn cao 160 cm → 20 : 40 = 0.5 (đứng giữa).</w:t>
+            </w:r>
+          </w:p>
+          <w:p>
+            <w:pPr>
+              <w:spacing w:after="60" w:line="300"/>
+            </w:pPr>
+            <w:r>
+              <w:rPr>
+                <w:rFonts w:ascii="Times New Roman" w:cs="Times New Roman" w:eastAsia="Times New Roman" w:hAnsi="Times New Roman"/>
+                <w:color w:val="1D2B44"/>
+                <w:sz w:val="26"/>
+                <w:szCs w:val="26"/>
+              </w:rPr>
+              <w:t xml:space="preserve">Điểm Toán từ 0 đến 10, cả quãng là 10: điểm 9 → 9 : 10 = </w:t>
+            </w:r>
+            <w:r>
+              <w:rPr>
+                <w:rFonts w:ascii="Times New Roman" w:cs="Times New Roman" w:eastAsia="Times New Roman" w:hAnsi="Times New Roman"/>
+                <w:b/>
+                <w:bCs/>
+                <w:color w:val="1D2B44"/>
+                <w:sz w:val="26"/>
+                <w:szCs w:val="26"/>
+              </w:rPr>
+              <w:t xml:space="preserve">0.9</w:t>
+            </w:r>
+            <w:r>
+              <w:rPr>
+                <w:rFonts w:ascii="Times New Roman" w:cs="Times New Roman" w:eastAsia="Times New Roman" w:hAnsi="Times New Roman"/>
+                <w:color w:val="1D2B44"/>
+                <w:sz w:val="26"/>
+                <w:szCs w:val="26"/>
+              </w:rPr>
+              <w:t xml:space="preserve">; điểm 3 → </w:t>
+            </w:r>
+            <w:r>
+              <w:rPr>
+                <w:rFonts w:ascii="Times New Roman" w:cs="Times New Roman" w:eastAsia="Times New Roman" w:hAnsi="Times New Roman"/>
+                <w:b/>
+                <w:bCs/>
+                <w:color w:val="1D2B44"/>
+                <w:sz w:val="26"/>
+                <w:szCs w:val="26"/>
+              </w:rPr>
+              <w:t xml:space="preserve">0.3</w:t>
+            </w:r>
+            <w:r>
+              <w:rPr>
+                <w:rFonts w:ascii="Times New Roman" w:cs="Times New Roman" w:eastAsia="Times New Roman" w:hAnsi="Times New Roman"/>
+                <w:color w:val="1D2B44"/>
+                <w:sz w:val="26"/>
+                <w:szCs w:val="26"/>
+              </w:rPr>
+              <w:t xml:space="preserve">.</w:t>
+            </w:r>
+          </w:p>
+        </w:tc>
+      </w:tr>
+    </w:tbl>
+    <w:p>
+      <w:pPr>
+        <w:spacing w:after="140"/>
+      </w:pPr>
     </w:p>
     <w:p>
       <w:pPr>
@@ -7284,9 +7976,9 @@
       <w:r>
         <w:drawing>
           <wp:inline distT="0" distB="0" distL="0" distR="0">
-            <wp:extent cx="4762500" cy="2047875"/>
+            <wp:extent cx="5334000" cy="1924050"/>
             <wp:effectExtent t="0" r="0" b="0" l="0"/>
-            <wp:docPr id="1" name="f6_chuan_hoa.png" descr="Trước khi chuẩn hóa, chênh lệch chiều cao &quot;lấn át&quot;. Sau khi chuẩn hóa, hai đặc trưng ngang nhau." title="Hình 6"/>
+            <wp:docPr id="1" name="f6_chuan_hoa.png" descr="Mỗi bạn là một thanh: phần tô màu là quãng đã đi được tính từ chỗ thấp nhất. Thấp nhất → 0, cao nhất → 1." title="Hình 6"/>
             <wp:cNvGraphicFramePr>
               <a:graphicFrameLocks xmlns:a="http://schemas.openxmlformats.org/drawingml/2006/main" noChangeAspect="1"/>
             </wp:cNvGraphicFramePr>
@@ -7309,7 +8001,7 @@
                   <pic:spPr bwMode="auto">
                     <a:xfrm>
                       <a:off x="0" y="0"/>
-                      <a:ext cx="4762500" cy="2047875"/>
+                      <a:ext cx="5334000" cy="1924050"/>
                     </a:xfrm>
                     <a:prstGeom prst="rect">
                       <a:avLst/>
@@ -7336,7 +8028,7 @@
           <w:sz w:val="26"/>
           <w:szCs w:val="26"/>
         </w:rPr>
-        <w:t xml:space="preserve">Hình 6. Trước khi chuẩn hóa, chênh lệch chiều cao "lấn át". Sau khi chuẩn hóa, hai đặc trưng ngang nhau.</w:t>
+        <w:t xml:space="preserve">Hình 6. Mỗi bạn là một thanh: phần tô màu là quãng đã đi được tính từ chỗ thấp nhất. Thấp nhất → 0, cao nhất → 1.</w:t>
       </w:r>
     </w:p>
     <w:p>
@@ -7351,64 +8043,122 @@
           <w:sz w:val="26"/>
           <w:szCs w:val="26"/>
         </w:rPr>
-        <w:t xml:space="preserve">Cách sửa: </w:t>
-      </w:r>
-      <w:r>
-        <w:rPr>
-          <w:rFonts w:ascii="Times New Roman" w:cs="Times New Roman" w:eastAsia="Times New Roman" w:hAnsi="Times New Roman"/>
-          <w:b/>
-          <w:bCs/>
-          <w:color w:val="1D2B44"/>
-          <w:sz w:val="26"/>
-          <w:szCs w:val="26"/>
-        </w:rPr>
-        <w:t xml:space="preserve">chuẩn hóa</w:t>
-      </w:r>
-      <w:r>
-        <w:rPr>
-          <w:rFonts w:ascii="Times New Roman" w:cs="Times New Roman" w:eastAsia="Times New Roman" w:hAnsi="Times New Roman"/>
-          <w:color w:val="1D2B44"/>
-          <w:sz w:val="26"/>
-          <w:szCs w:val="26"/>
-        </w:rPr>
-        <w:t xml:space="preserve"> mỗi cột về cùng một thang từ 0 đến 1. Cách đơn giản nhất là </w:t>
-      </w:r>
-      <w:r>
-        <w:rPr>
-          <w:rFonts w:ascii="Times New Roman" w:cs="Times New Roman" w:eastAsia="Times New Roman" w:hAnsi="Times New Roman"/>
-          <w:b/>
-          <w:bCs/>
-          <w:color w:val="1D2B44"/>
-          <w:sz w:val="26"/>
-          <w:szCs w:val="26"/>
-        </w:rPr>
-        <w:t xml:space="preserve">chuẩn hóa min-max</w:t>
-      </w:r>
-      <w:r>
-        <w:rPr>
-          <w:rFonts w:ascii="Times New Roman" w:cs="Times New Roman" w:eastAsia="Times New Roman" w:hAnsi="Times New Roman"/>
-          <w:color w:val="1D2B44"/>
-          <w:sz w:val="26"/>
-          <w:szCs w:val="26"/>
-        </w:rPr>
-        <w:t xml:space="preserve">:</w:t>
-      </w:r>
-    </w:p>
-    <w:p>
-      <w:pPr>
-        <w:spacing w:after="120" w:before="60" w:line="300"/>
-        <w:jc w:val="center"/>
-      </w:pPr>
-      <w:r>
-        <w:rPr>
-          <w:rFonts w:ascii="Times New Roman" w:cs="Times New Roman" w:eastAsia="Times New Roman" w:hAnsi="Times New Roman"/>
-          <w:b/>
-          <w:bCs/>
-          <w:color w:val="1A5FC8"/>
-          <w:sz w:val="26"/>
-          <w:szCs w:val="26"/>
-        </w:rPr>
-        <w:t xml:space="preserve">giá trị mới = (giá trị − nhỏ nhất) : (lớn nhất − nhỏ nhất)</w:t>
+        <w:t xml:space="preserve">Tính lại tổng bình phương với số mới:</w:t>
+      </w:r>
+    </w:p>
+    <w:p>
+      <w:pPr>
+        <w:pStyle w:val="ListParagraph"/>
+        <w:numPr>
+          <w:ilvl w:val="0"/>
+          <w:numId w:val="2"/>
+        </w:numPr>
+        <w:spacing w:after="60" w:line="300"/>
+        <w:jc w:val="left"/>
+      </w:pPr>
+      <w:r>
+        <w:rPr>
+          <w:rFonts w:ascii="Times New Roman" w:cs="Times New Roman" w:eastAsia="Times New Roman" w:hAnsi="Times New Roman"/>
+          <w:color w:val="1D2B44"/>
+          <w:sz w:val="26"/>
+          <w:szCs w:val="26"/>
+        </w:rPr>
+        <w:t xml:space="preserve">An – Bình: (0.75 − 0.25)² + 0² = 0.5² = </w:t>
+      </w:r>
+      <w:r>
+        <w:rPr>
+          <w:rFonts w:ascii="Times New Roman" w:cs="Times New Roman" w:eastAsia="Times New Roman" w:hAnsi="Times New Roman"/>
+          <w:b/>
+          <w:bCs/>
+          <w:color w:val="1D2B44"/>
+          <w:sz w:val="26"/>
+          <w:szCs w:val="26"/>
+        </w:rPr>
+        <w:t xml:space="preserve">0.25</w:t>
+      </w:r>
+      <w:r>
+        <w:rPr>
+          <w:rFonts w:ascii="Times New Roman" w:cs="Times New Roman" w:eastAsia="Times New Roman" w:hAnsi="Times New Roman"/>
+          <w:color w:val="1D2B44"/>
+          <w:sz w:val="26"/>
+          <w:szCs w:val="26"/>
+        </w:rPr>
+        <w:t xml:space="preserve">.</w:t>
+      </w:r>
+    </w:p>
+    <w:p>
+      <w:pPr>
+        <w:pStyle w:val="ListParagraph"/>
+        <w:numPr>
+          <w:ilvl w:val="0"/>
+          <w:numId w:val="2"/>
+        </w:numPr>
+        <w:spacing w:after="60" w:line="300"/>
+        <w:jc w:val="left"/>
+      </w:pPr>
+      <w:r>
+        <w:rPr>
+          <w:rFonts w:ascii="Times New Roman" w:cs="Times New Roman" w:eastAsia="Times New Roman" w:hAnsi="Times New Roman"/>
+          <w:color w:val="1D2B44"/>
+          <w:sz w:val="26"/>
+          <w:szCs w:val="26"/>
+        </w:rPr>
+        <w:t xml:space="preserve">An – Chi: (0.3 − 0.25)² + (0.9 − 0.3)² = 0.0025 + 0.36 ≈ </w:t>
+      </w:r>
+      <w:r>
+        <w:rPr>
+          <w:rFonts w:ascii="Times New Roman" w:cs="Times New Roman" w:eastAsia="Times New Roman" w:hAnsi="Times New Roman"/>
+          <w:b/>
+          <w:bCs/>
+          <w:color w:val="1D2B44"/>
+          <w:sz w:val="26"/>
+          <w:szCs w:val="26"/>
+        </w:rPr>
+        <w:t xml:space="preserve">0.36</w:t>
+      </w:r>
+      <w:r>
+        <w:rPr>
+          <w:rFonts w:ascii="Times New Roman" w:cs="Times New Roman" w:eastAsia="Times New Roman" w:hAnsi="Times New Roman"/>
+          <w:color w:val="1D2B44"/>
+          <w:sz w:val="26"/>
+          <w:szCs w:val="26"/>
+        </w:rPr>
+        <w:t xml:space="preserve">.</w:t>
+      </w:r>
+    </w:p>
+    <w:p>
+      <w:pPr>
+        <w:spacing w:after="100" w:line="300"/>
+        <w:jc w:val="both"/>
+      </w:pPr>
+      <w:r>
+        <w:rPr>
+          <w:rFonts w:ascii="Times New Roman" w:cs="Times New Roman" w:eastAsia="Times New Roman" w:hAnsi="Times New Roman"/>
+          <w:color w:val="1D2B44"/>
+          <w:sz w:val="26"/>
+          <w:szCs w:val="26"/>
+        </w:rPr>
+        <w:t xml:space="preserve">Giờ máy nói </w:t>
+      </w:r>
+      <w:r>
+        <w:rPr>
+          <w:rFonts w:ascii="Times New Roman" w:cs="Times New Roman" w:eastAsia="Times New Roman" w:hAnsi="Times New Roman"/>
+          <w:b/>
+          <w:bCs/>
+          <w:color w:val="1D2B44"/>
+          <w:sz w:val="26"/>
+          <w:szCs w:val="26"/>
+        </w:rPr>
+        <w:t xml:space="preserve">Bình gần An hơn</w:t>
+      </w:r>
+      <w:r>
+        <w:rPr>
+          <w:rFonts w:ascii="Times New Roman" w:cs="Times New Roman" w:eastAsia="Times New Roman" w:hAnsi="Times New Roman"/>
+          <w:color w:val="1D2B44"/>
+          <w:sz w:val="26"/>
+          <w:szCs w:val="26"/>
+        </w:rPr>
+        <w:t xml:space="preserve">, đúng như cảm nhận. Đo bằng xăng-ti-mét hay mét thì số mới vẫn y hệt (1.50 m vẫn ra 0.25), nên kết luận không còn phụ thuộc đơn vị.</w:t>
       </w:r>
     </w:p>
     <w:tbl>
@@ -7435,11 +8185,11 @@
             <w:tcW w:type="dxa" w:w="9638"/>
             <w:tcBorders>
               <w:top w:val="none" w:color="FFFFFF" w:sz="0"/>
-              <w:left w:val="single" w:color="8A94A6" w:sz="36"/>
+              <w:left w:val="single" w:color="1A5FC8" w:sz="36"/>
               <w:bottom w:val="none" w:color="FFFFFF" w:sz="0"/>
               <w:right w:val="none" w:color="FFFFFF" w:sz="0"/>
             </w:tcBorders>
-            <w:shd w:fill="F3F5F8" w:color="auto" w:val="clear"/>
+            <w:shd w:fill="E7F0FF" w:color="auto" w:val="clear"/>
             <w:tcMar>
               <w:top w:type="dxa" w:w="120"/>
               <w:left w:type="dxa" w:w="220"/>
@@ -7456,127 +8206,36 @@
                 <w:rFonts w:ascii="Times New Roman" w:cs="Times New Roman" w:eastAsia="Times New Roman" w:hAnsi="Times New Roman"/>
                 <w:b/>
                 <w:bCs/>
-                <w:color w:val="8A94A6"/>
-                <w:sz w:val="26"/>
-                <w:szCs w:val="26"/>
-              </w:rPr>
-              <w:t xml:space="preserve">VÍ DỤ</w:t>
+                <w:color w:val="1A5FC8"/>
+                <w:sz w:val="26"/>
+                <w:szCs w:val="26"/>
+              </w:rPr>
+              <w:t xml:space="preserve">GHI NHỚ</w:t>
             </w:r>
           </w:p>
           <w:p>
             <w:pPr>
               <w:spacing w:after="60" w:line="300"/>
-            </w:pPr>
-            <w:r>
-              <w:rPr>
-                <w:rFonts w:ascii="Times New Roman" w:cs="Times New Roman" w:eastAsia="Times New Roman" w:hAnsi="Times New Roman"/>
-                <w:color w:val="1D2B44"/>
-                <w:sz w:val="26"/>
-                <w:szCs w:val="26"/>
-              </w:rPr>
-              <w:t xml:space="preserve">Cột chiều cao: nhỏ nhất 150, lớn nhất 165. Khi đó 150 → 0; 165 → 1; 152 → (152 − 150) : 15 = 2 : 15 ≈ 0.13.</w:t>
-            </w:r>
-          </w:p>
-          <w:p>
-            <w:pPr>
-              <w:spacing w:after="60" w:line="300"/>
-            </w:pPr>
-            <w:r>
-              <w:rPr>
-                <w:rFonts w:ascii="Times New Roman" w:cs="Times New Roman" w:eastAsia="Times New Roman" w:hAnsi="Times New Roman"/>
-                <w:color w:val="1D2B44"/>
-                <w:sz w:val="26"/>
-                <w:szCs w:val="26"/>
-              </w:rPr>
-              <w:t xml:space="preserve">Cột điểm Toán: nhỏ nhất 3, lớn nhất 9. Khi đó 9 → 1; 3 → 0.</w:t>
-            </w:r>
-          </w:p>
-          <w:p>
-            <w:pPr>
-              <w:spacing w:after="60" w:line="300"/>
-            </w:pPr>
-            <w:r>
-              <w:rPr>
-                <w:rFonts w:ascii="Times New Roman" w:cs="Times New Roman" w:eastAsia="Times New Roman" w:hAnsi="Times New Roman"/>
-                <w:color w:val="1D2B44"/>
-                <w:sz w:val="26"/>
-                <w:szCs w:val="26"/>
-              </w:rPr>
-              <w:t xml:space="preserve">Sau chuẩn hóa: An (0, 1), Bình (1, 1), Chi (0.13, 0). An – Bình: 1² + 0² = 1. An – Chi: 0.13² + 1² ≈ 0.02 + 1 = 1.02 (vì 0.13² = 0.0169, rất nhỏ). Giờ hai đặc trưng có "tiếng nói" ngang nhau.</w:t>
-            </w:r>
-          </w:p>
-        </w:tc>
-      </w:tr>
-    </w:tbl>
-    <w:p>
-      <w:pPr>
-        <w:spacing w:after="140"/>
-      </w:pPr>
-    </w:p>
-    <w:tbl>
-      <w:tblPr>
-        <w:tblW w:type="dxa" w:w="9638"/>
-        <w:tblBorders>
-          <w:top w:val="single" w:color="auto" w:sz="4"/>
-          <w:left w:val="single" w:color="auto" w:sz="4"/>
-          <w:bottom w:val="single" w:color="auto" w:sz="4"/>
-          <w:right w:val="single" w:color="auto" w:sz="4"/>
-          <w:insideH w:val="single" w:color="auto" w:sz="4"/>
-          <w:insideV w:val="single" w:color="auto" w:sz="4"/>
-        </w:tblBorders>
-      </w:tblPr>
-      <w:tblGrid>
-        <w:gridCol w:w="9638"/>
-      </w:tblGrid>
-      <w:tr>
-        <w:trPr>
-          <w:cantSplit/>
-        </w:trPr>
-        <w:tc>
-          <w:tcPr>
-            <w:tcW w:type="dxa" w:w="9638"/>
-            <w:tcBorders>
-              <w:top w:val="none" w:color="FFFFFF" w:sz="0"/>
-              <w:left w:val="single" w:color="1A5FC8" w:sz="36"/>
-              <w:bottom w:val="none" w:color="FFFFFF" w:sz="0"/>
-              <w:right w:val="none" w:color="FFFFFF" w:sz="0"/>
-            </w:tcBorders>
-            <w:shd w:fill="E7F0FF" w:color="auto" w:val="clear"/>
-            <w:tcMar>
-              <w:top w:type="dxa" w:w="120"/>
-              <w:left w:type="dxa" w:w="220"/>
-              <w:bottom w:type="dxa" w:w="120"/>
-              <w:right w:type="dxa" w:w="180"/>
-            </w:tcMar>
-          </w:tcPr>
-          <w:p>
-            <w:pPr>
-              <w:spacing w:after="80"/>
             </w:pPr>
             <w:r>
               <w:rPr>
                 <w:rFonts w:ascii="Times New Roman" w:cs="Times New Roman" w:eastAsia="Times New Roman" w:hAnsi="Times New Roman"/>
                 <w:b/>
                 <w:bCs/>
-                <w:color w:val="1A5FC8"/>
-                <w:sz w:val="26"/>
-                <w:szCs w:val="26"/>
-              </w:rPr>
-              <w:t xml:space="preserve">GHI NHỚ</w:t>
-            </w:r>
-          </w:p>
-          <w:p>
-            <w:pPr>
-              <w:spacing w:after="60" w:line="300"/>
-            </w:pPr>
-            <w:r>
-              <w:rPr>
-                <w:rFonts w:ascii="Times New Roman" w:cs="Times New Roman" w:eastAsia="Times New Roman" w:hAnsi="Times New Roman"/>
-                <w:color w:val="1D2B44"/>
-                <w:sz w:val="26"/>
-                <w:szCs w:val="26"/>
-              </w:rPr>
-              <w:t xml:space="preserve">Các thuật toán dùng khoảng cách (</w:t>
+                <w:color w:val="1D2B44"/>
+                <w:sz w:val="26"/>
+                <w:szCs w:val="26"/>
+              </w:rPr>
+              <w:t xml:space="preserve">k-NN</w:t>
+            </w:r>
+            <w:r>
+              <w:rPr>
+                <w:rFonts w:ascii="Times New Roman" w:cs="Times New Roman" w:eastAsia="Times New Roman" w:hAnsi="Times New Roman"/>
+                <w:color w:val="1D2B44"/>
+                <w:sz w:val="26"/>
+                <w:szCs w:val="26"/>
+              </w:rPr>
+              <w:t xml:space="preserve">, </w:t>
             </w:r>
             <w:r>
               <w:rPr>
@@ -7587,16 +8246,16 @@
                 <w:sz w:val="26"/>
                 <w:szCs w:val="26"/>
               </w:rPr>
-              <w:t xml:space="preserve">k-NN</w:t>
-            </w:r>
-            <w:r>
-              <w:rPr>
-                <w:rFonts w:ascii="Times New Roman" w:cs="Times New Roman" w:eastAsia="Times New Roman" w:hAnsi="Times New Roman"/>
-                <w:color w:val="1D2B44"/>
-                <w:sz w:val="26"/>
-                <w:szCs w:val="26"/>
-              </w:rPr>
-              <w:t xml:space="preserve">, </w:t>
+              <w:t xml:space="preserve">K-means</w:t>
+            </w:r>
+            <w:r>
+              <w:rPr>
+                <w:rFonts w:ascii="Times New Roman" w:cs="Times New Roman" w:eastAsia="Times New Roman" w:hAnsi="Times New Roman"/>
+                <w:color w:val="1D2B44"/>
+                <w:sz w:val="26"/>
+                <w:szCs w:val="26"/>
+              </w:rPr>
+              <w:t xml:space="preserve"> và </w:t>
             </w:r>
             <w:r>
               <w:rPr>
@@ -7607,16 +8266,16 @@
                 <w:sz w:val="26"/>
                 <w:szCs w:val="26"/>
               </w:rPr>
-              <w:t xml:space="preserve">K-means</w:t>
-            </w:r>
-            <w:r>
-              <w:rPr>
-                <w:rFonts w:ascii="Times New Roman" w:cs="Times New Roman" w:eastAsia="Times New Roman" w:hAnsi="Times New Roman"/>
-                <w:color w:val="1D2B44"/>
-                <w:sz w:val="26"/>
-                <w:szCs w:val="26"/>
-              </w:rPr>
-              <w:t xml:space="preserve">) và </w:t>
+              <w:t xml:space="preserve">SVM</w:t>
+            </w:r>
+            <w:r>
+              <w:rPr>
+                <w:rFonts w:ascii="Times New Roman" w:cs="Times New Roman" w:eastAsia="Times New Roman" w:hAnsi="Times New Roman"/>
+                <w:color w:val="1D2B44"/>
+                <w:sz w:val="26"/>
+                <w:szCs w:val="26"/>
+              </w:rPr>
+              <w:t xml:space="preserve"> đều dựa vào khoảng cách hoặc phép nhân với từng cột, nên đều cần </w:t>
             </w:r>
             <w:r>
               <w:rPr>
@@ -7627,26 +8286,6 @@
                 <w:sz w:val="26"/>
                 <w:szCs w:val="26"/>
               </w:rPr>
-              <w:t xml:space="preserve">SVM</w:t>
-            </w:r>
-            <w:r>
-              <w:rPr>
-                <w:rFonts w:ascii="Times New Roman" w:cs="Times New Roman" w:eastAsia="Times New Roman" w:hAnsi="Times New Roman"/>
-                <w:color w:val="1D2B44"/>
-                <w:sz w:val="26"/>
-                <w:szCs w:val="26"/>
-              </w:rPr>
-              <w:t xml:space="preserve"> đều cần </w:t>
-            </w:r>
-            <w:r>
-              <w:rPr>
-                <w:rFonts w:ascii="Times New Roman" w:cs="Times New Roman" w:eastAsia="Times New Roman" w:hAnsi="Times New Roman"/>
-                <w:b/>
-                <w:bCs/>
-                <w:color w:val="1D2B44"/>
-                <w:sz w:val="26"/>
-                <w:szCs w:val="26"/>
-              </w:rPr>
               <w:t xml:space="preserve">chuẩn hóa</w:t>
             </w:r>
             <w:r>
@@ -7656,7 +8295,21 @@
                 <w:sz w:val="26"/>
                 <w:szCs w:val="26"/>
               </w:rPr>
-              <w:t xml:space="preserve"> dữ liệu trước, để không đặc trưng nào lấn át đặc trưng khác.</w:t>
+              <w:t xml:space="preserve"> dữ liệu trước, để không cột nào lấn át cột khác.</w:t>
+            </w:r>
+          </w:p>
+          <w:p>
+            <w:pPr>
+              <w:spacing w:after="60" w:line="300"/>
+            </w:pPr>
+            <w:r>
+              <w:rPr>
+                <w:rFonts w:ascii="Times New Roman" w:cs="Times New Roman" w:eastAsia="Times New Roman" w:hAnsi="Times New Roman"/>
+                <w:color w:val="1D2B44"/>
+                <w:sz w:val="26"/>
+                <w:szCs w:val="26"/>
+              </w:rPr>
+              <w:t xml:space="preserve">Sau chuẩn hóa min-max: nhỏ nhất → 0, lớn nhất → 1, đứng giữa → 0.5.</w:t>
             </w:r>
           </w:p>
         </w:tc>

</xml_diff>